<commit_message>
Final verification pass: correct report numbers, add claim checker
verify_claims.py recomputes 30 hand-typed report numbers from the raw
runs (30/30 pass). Corrections: X1 cost-table CIs now match x1_costs.md,
full-oversight welfare Holm p 0.022, competitor gain 26%, judge result
10/10 runs (rho -0.52, p=0.002). Wording fixes from the full read;
abstract 239 words. Corrections logged in SPRINT_PROTOCOL.md.

Co-Authored-By: Claude Opus 5.5 <noreply@anthropic.com>
</commit_message>
<xml_diff>
--- a/report/Apart_Collusion_Sprint_Report_Manu_Nicholas_Jacob.docx
+++ b/report/Apart_Collusion_Sprint_Report_Manu_Nicholas_Jacob.docx
@@ -391,7 +391,7 @@
                       <w:iCs w:val="1"/>
                       <w:rtl w:val="0"/>
                     </w:rPr>
-                    <w:t>Which single restriction removes the most LLM-agent collusion at the least cost? Prior work compares anti-collusion levers by their effect alone; we also price them. In the continuous double auction of Agrawal et al. (2025) we first audit the reference "oversight" lever in the authors' public runs: its LLM monitor fired in 20 of 20 runs within seven rounds and limited sellers to five-character messages for 77 to 97% of each run, so it acts as a delayed communication ban rather than light-touch monitoring. We then run a pre-registered, powered study of seven levers (25 runs each) with Llama-3.3-70B sellers, separating a monitoring notice from the monitor, varying the monitoring budget, and adding a single no-regret competitor seller. Our positive control failed: neither Llama-3.3-70B nor GPT-4.1-mini sellers colluded when allowed to communicate, so no lever could reduce collusion, and the study measures what levers cost a market that is not colluding. The monitor punished innocent markets in up to 48% of runs. A monitoring notice lowered buyer welfare by 22% while the monitor without the notice had no detectable effect, and banning communication cost 13% of trades. One no-regret seller raised buyer welfare by 27%. A replication on 75 fresh runs, pre-registered before it ran, confirmed both welfare effects (notice -16%, competitor +44%) but not the notice's effect on trade volume. Anti-collusion levers carry false-positive costs that should be measured alongside their benefits.</w:t>
+                    <w:t>Which single restriction removes the most LLM-agent collusion at the least cost? Prior work compares anti-collusion levers by their effect alone; we also price them. In the continuous double auction of Agrawal et al. (2025) we first audit the reference "oversight" lever in the authors' public runs: its LLM monitor fired in 20 of 20 runs within seven rounds and limited sellers to five-character messages for 77 to 97% of each run, so it acts as a delayed communication ban rather than light-touch monitoring. We then run a pre-registered, powered study of seven levers (25 runs each) with Llama-3.3-70B sellers, separating a monitoring notice from the monitor, varying the monitoring budget, and adding a single no-regret competitor seller. Our positive control failed: neither Llama-3.3-70B nor GPT-4.1-mini sellers colluded when allowed to communicate, so no lever could reduce collusion, and the study measures what levers cost a market that is not colluding. The monitor punished innocent markets in up to 48% of runs. A monitoring notice lowered buyer welfare by 22% while the monitor without the notice had no detectable effect, and banning communication cost 13% of trades. One no-regret seller raised buyer welfare by 26%. A replication on 75 fresh runs, pre-registered before it ran, confirmed both welfare effects (16% lower under the notice, 44% higher with the competitor) but not the notice's effect on trade volume. Anti-collusion levers carry false-positive costs that should be measured alongside their benefits.</w:t>
                   </w:r>
                 </w:p>
               </w:tc>
@@ -920,35 +920,35 @@
               <w:rPr>
                 <w:sz w:val="17"/>
               </w:rPr>
-              <w:t>-5.3 [-14.0, +3.3]</w:t>
-            </w:r>
-          </w:p>
-        </w:tc>
-        <w:tc>
-          <w:tcPr>
-            <w:tcW w:type="dxa" w:w="2340"/>
-          </w:tcPr>
-          <w:p>
-            <w:r/>
-            <w:r>
-              <w:rPr>
-                <w:sz w:val="17"/>
-              </w:rPr>
-              <w:t>-0.3 [-4.3, +3.6]</w:t>
-            </w:r>
-          </w:p>
-        </w:tc>
-        <w:tc>
-          <w:tcPr>
-            <w:tcW w:type="dxa" w:w="2340"/>
-          </w:tcPr>
-          <w:p>
-            <w:r/>
-            <w:r>
-              <w:rPr>
-                <w:sz w:val="17"/>
-              </w:rPr>
-              <w:t>-$97 [-225, +24]</w:t>
+              <w:t>-5.3 [-13.7, +3.0]</w:t>
+            </w:r>
+          </w:p>
+        </w:tc>
+        <w:tc>
+          <w:tcPr>
+            <w:tcW w:type="dxa" w:w="2340"/>
+          </w:tcPr>
+          <w:p>
+            <w:r/>
+            <w:r>
+              <w:rPr>
+                <w:sz w:val="17"/>
+              </w:rPr>
+              <w:t>-0.3 [-4.2, +3.7]</w:t>
+            </w:r>
+          </w:p>
+        </w:tc>
+        <w:tc>
+          <w:tcPr>
+            <w:tcW w:type="dxa" w:w="2340"/>
+          </w:tcPr>
+          <w:p>
+            <w:r/>
+            <w:r>
+              <w:rPr>
+                <w:sz w:val="17"/>
+              </w:rPr>
+              <w:t>-$97 [-224, +18]</w:t>
             </w:r>
           </w:p>
         </w:tc>
@@ -978,35 +978,35 @@
               <w:rPr>
                 <w:sz w:val="17"/>
               </w:rPr>
-              <w:t>-10.1 [-20.5, +0.1]</w:t>
-            </w:r>
-          </w:p>
-        </w:tc>
-        <w:tc>
-          <w:tcPr>
-            <w:tcW w:type="dxa" w:w="2340"/>
-          </w:tcPr>
-          <w:p>
-            <w:r/>
-            <w:r>
-              <w:rPr>
-                <w:sz w:val="17"/>
-              </w:rPr>
-              <w:t>-4.8 [-8.4, -1.1], Holm p=0.025</w:t>
-            </w:r>
-          </w:p>
-        </w:tc>
-        <w:tc>
-          <w:tcPr>
-            <w:tcW w:type="dxa" w:w="2340"/>
-          </w:tcPr>
-          <w:p>
-            <w:r/>
-            <w:r>
-              <w:rPr>
-                <w:sz w:val="17"/>
-              </w:rPr>
-              <w:t>-$59 [-209, +83]</w:t>
+              <w:t>-10.1 [-20.8, +0.5]</w:t>
+            </w:r>
+          </w:p>
+        </w:tc>
+        <w:tc>
+          <w:tcPr>
+            <w:tcW w:type="dxa" w:w="2340"/>
+          </w:tcPr>
+          <w:p>
+            <w:r/>
+            <w:r>
+              <w:rPr>
+                <w:sz w:val="17"/>
+              </w:rPr>
+              <w:t>-4.8 [-8.4, -1.1], Holm p=0.022</w:t>
+            </w:r>
+          </w:p>
+        </w:tc>
+        <w:tc>
+          <w:tcPr>
+            <w:tcW w:type="dxa" w:w="2340"/>
+          </w:tcPr>
+          <w:p>
+            <w:r/>
+            <w:r>
+              <w:rPr>
+                <w:sz w:val="17"/>
+              </w:rPr>
+              <w:t>-$59 [-211, +85]</w:t>
             </w:r>
           </w:p>
         </w:tc>
@@ -1122,7 +1122,7 @@
               <w:rPr>
                 <w:sz w:val="17"/>
               </w:rPr>
-              <w:t>-$41 [-187, +106]</w:t>
+              <w:t>-$41 [-187, +104]</w:t>
             </w:r>
           </w:p>
         </w:tc>
@@ -1139,7 +1139,7 @@
       </w:pPr>
       <w:r>
         <w:rPr/>
-        <w:t>The warning, not the monitor, does the damage: arms that include the notice lose buyer welfare (and, in this sample, trades), while the monitor without the notice does not. Warned sellers turned their messages toward compliance (28% of messages mention monitoring or regulation, against 3% without the notice) and held slightly higher asks. A communication ban costs liquidity because these sellers used messages to converge on tradable prices. The no-regret seller is the only lever that helps buyers, lowering mean trade prices by $1.41. In this sample the trade effect also survives a rank test (median 60 versus 82 trades, Mann-Whitney p=0.005), but it did not replicate (Section 4.5).</w:t>
+        <w:t>The warning, not the monitor, does the damage: arms that include the notice lose buyer welfare (and, for the notice alone, trades), while the monitor without the notice does not. Warned sellers turned their messages toward compliance (28% of messages mention monitoring or regulation, against 3% without the notice) and held slightly higher asks. A communication ban costs liquidity because these sellers used messages to converge on tradable prices. The no-regret seller is the only lever that helps buyers, lowering mean trade prices by $1.41. In this sample the notice's trade effect also survives a rank test (median 60 versus 82 trades, Mann-Whitney p=0.005), but it did not replicate (Section 4.5).</w:t>
       </w:r>
     </w:p>
     <w:p>
@@ -1496,7 +1496,7 @@
       </w:r>
       <w:r>
         <w:rPr/>
-        <w:t xml:space="preserve"> (i) Detection (Q1.3, Q1.4): on the gpt-4.1 runs, Bonjour et al.'s net influence at its published threshold flags 70% of no-communication runs; calibrated at the 90th percentile of no-communication runs, net influence and a transfer-entropy statistic each detect 4 of 10 communication runs at a 10% false-positive rate. (ii) Judges (Q2.3): within communication runs, the LLM judge's coordination score rose while prices fell in 9 of 9 runs (mean within-run rho -0.49, sign test p=0.004); on round-to-round changes the correlation vanishes (rho -0.04). The judge measures talk, not market outcomes. (iii) Channel movement (Q3.4): under the gag, gpt-4.1 messages fell by 99.4% but price-path dependence did not rise, so we find no evidence that coordination moved into prices.</w:t>
+        <w:t xml:space="preserve"> (i) Detection (Q1.3, Q1.4): on the gpt-4.1 runs, Bonjour et al.'s net influence at its published threshold flags 70% of no-communication runs; calibrated at the 90th percentile of no-communication runs, net influence and a transfer-entropy statistic each detect 4 of 10 communication runs at a 10% false-positive rate. (ii) Judges (Q2.3): within communication runs, the LLM judge's coordination score rose while prices fell in 10 of 10 runs (mean within-run rho -0.52, sign test p=0.002); on round-to-round changes the correlation vanishes (rho -0.04). The judge measures talk, not market outcomes. (iii) Channel movement (Q3.4): under the gag, gpt-4.1 messages fell by 99.4% but price-path dependence did not rise, so we find no evidence that coordination moved into prices.</w:t>
       </w:r>
     </w:p>
     <w:p>
@@ -1513,7 +1513,7 @@
       </w:pPr>
       <w:r>
         <w:rPr/>
-        <w:t>The same lever can help or hurt depending on whether collusion is present. In the gpt-4.1 data, where sellers colluded weakly, oversight acted as a ban and raised buyer welfare (27.2 versus 19.8 per round). In Llama markets that did not collude, the warning attached to oversight lowered buyer welfare by about a fifth and the monitor misfired in up to half of runs. A platform therefore cannot judge a lever by its effect on colluding markets alone; it should also measure its false-positive cost, the harm to the many markets that are behaving competitively. By that standard the most attractive lever we tested is a competitor rather than a cop: a single no-regret seller costs no communication and no monitoring and improved buyer outcomes. For AI-control practice, a monitor with a hair-trigger, permanent penalty spends its whole usefulness budget on false positives, and the warning that announces it can impose costs by itself.</w:t>
+        <w:t>The same lever can help or hurt depending on whether collusion is present. In the gpt-4.1 data, where sellers colluded weakly, oversight acted as a ban and raised buyer welfare (27.2 versus 19.8 per round). In Llama markets that did not collude, the warning attached to oversight lowered buyer welfare by 16 to 22% and the monitor misfired in up to half of runs. A platform therefore cannot judge a lever by its effect on colluding markets alone; it should also measure its false-positive cost, the harm to the many markets that are behaving competitively. By that standard the most attractive lever we tested is a competitor rather than a cop: a single no-regret seller costs no communication and no monitoring and improved buyer outcomes. For AI-control practice, a monitor with a hair-trigger, permanent penalty spends its whole usefulness budget on false positives, and the warning that announces it can impose costs by itself.</w:t>
       </w:r>
     </w:p>
     <w:p>

</xml_diff>

<commit_message>
Add DOI; report now links to this repository and its Zenodo archive
Co-Authored-By: Claude Opus 5.5 <noreply@anthropic.com>
</commit_message>
<xml_diff>
--- a/report/Apart_Collusion_Sprint_Report_Manu_Nicholas_Jacob.docx
+++ b/report/Apart_Collusion_Sprint_Report_Manu_Nicholas_Jacob.docx
@@ -628,7 +628,7 @@
       </w:r>
       <w:r>
         <w:rPr/>
-        <w:t xml:space="preserve"> A pilot (6 plus 6 runs per model) applied a pre-registered positive-control gate before the main study (25 runs per lever). Hypothesis tests use one-sided bootstrap differences (10,000 resamples) with Holm correction; exploratory comparisons use two-sided bootstrap intervals and are labelled as such. The exploratory effects of the notice and the no-regret seller were then tested in a confirmatory replication, pre-registered before any of its 75 fresh runs (25 each of communication, notice and no-regret seller), with Holm correction over its three tests. Every design decision, deviation and runtime fix is timestamped in a protocol committed to git before the analysis it governs. With the 2025 gpt-4.1 spread (SD 0.42), the original 10 runs per arm could detect only effects of 0.41 to 0.50 index units at 80% power, larger than the communication ban's own effect (0.28); 25 runs per arm detects 0.26 to 0.32.</w:t>
+        <w:t xml:space="preserve"> A pilot (6 plus 6 runs of Llama-3.3-70B, 3 plus 3 of GPT-4.1-mini) applied a pre-registered positive-control gate before the main study (25 runs per lever). Hypothesis tests use one-sided bootstrap differences (10,000 resamples) with Holm correction; exploratory comparisons use two-sided bootstrap intervals and are labelled as such. The exploratory effects of the notice and the no-regret seller were then tested in a confirmatory replication, pre-registered before any of its 75 fresh runs (25 each of communication, notice and no-regret seller), with Holm correction over its three tests. Every design decision, deviation and runtime fix is timestamped in a protocol committed to git before the analysis it governs. With the 2025 gpt-4.1 spread (SD 0.42), the original 10 runs per arm could detect only effects of 0.42 to 0.49 index units at 80% power (one-sided), larger than the communication ban's own effect (0.28); 25 runs per arm detects 0.26 to 0.30.</w:t>
       </w:r>
     </w:p>
     <w:p>
@@ -723,7 +723,7 @@
       </w:r>
       <w:r>
         <w:rPr/>
-        <w:t xml:space="preserve"> With communication, Llama-3.3-70B sellers did not price above the no-communication arm (index -0.006 versus +0.024, n=6 each), and GPT-4.1-mini sellers priced below the competitive level in both arms (-0.54 versus -0.48). In the main study the Llama communication baseline sits at the competitive price (index -0.00, 95% CI [-0.09, 0.08]). Following the pre-registered rule, the main study ran on Llama-3.3-70B. In the pre-registered tests (H1 notice, H2 monitor, H2b 25% monitor, H-mav competitor) no lever reduced collusion (all Holm p &gt; 0.8): there was no collusion to reduce.</w:t>
+        <w:t xml:space="preserve"> With communication, Llama-3.3-70B sellers did not price above the no-communication arm (index -0.006 versus +0.024, n=6 each), and GPT-4.1-mini sellers priced below the competitive level in both arms (-0.54 versus -0.48, n=3 each). In the main study the Llama communication baseline sits at the competitive price (index -0.00, 95% CI [-0.09, 0.08]). Following the pre-registered rule, the main study ran on Llama-3.3-70B. In the pre-registered tests (H1 notice, H2 monitor, H2b 25% monitor, H-mav competitor) no lever reduced collusion (all Holm p &gt; 0.8): there was no collusion to reduce.</w:t>
       </w:r>
     </w:p>
     <w:p>
@@ -1633,7 +1633,33 @@
       </w:pPr>
       <w:r>
         <w:rPr/>
-        <w:t>• Code: analysis, runners and harness changes (as a patch against the original repository), with a README marking pre-sprint and sprint work; available from the author on request.</w:t>
+        <w:t xml:space="preserve">• Code and data: </w:t>
+      </w:r>
+      <w:hyperlink r:id="rId10">
+        <w:r>
+          <w:rPr>
+            <w:color w:val="1155CC"/>
+            <w:u w:val="single"/>
+          </w:rPr>
+          <w:t xml:space="preserve">https://github.com/manunicholasjacob/llm-collusion-lever-costs</w:t>
+        </w:r>
+      </w:hyperlink>
+      <w:r>
+        <w:rPr/>
+        <w:t xml:space="preserve">, archived at </w:t>
+      </w:r>
+      <w:hyperlink r:id="rId11">
+        <w:r>
+          <w:rPr>
+            <w:color w:val="1155CC"/>
+            <w:u w:val="single"/>
+          </w:rPr>
+          <w:t xml:space="preserve">https://doi.org/10.5281/zenodo.23622463</w:t>
+        </w:r>
+      </w:hyperlink>
+      <w:r>
+        <w:rPr/>
+        <w:t>. It holds the analysis code, our harness changes as a patch against the original repository, all 268 sprint runs (market logs and monitor scores; per-agent transcripts on request), the timestamped protocol, and a script that recomputes this report's numbers from the runs.</w:t>
       </w:r>
     </w:p>
     <w:p>
@@ -1643,7 +1669,20 @@
       </w:pPr>
       <w:r>
         <w:rPr/>
-        <w:t>• Data: the original runs are in Agrawal et al.'s public repository (https://github.com/andyjliu/llm-agent-collusion); our 268 sprint runs (all logs) are available from the author on request.</w:t>
+        <w:t>• Original runs and harness: Agrawal et al.'s public repository (</w:t>
+      </w:r>
+      <w:hyperlink r:id="rId12">
+        <w:r>
+          <w:rPr>
+            <w:color w:val="1155CC"/>
+            <w:u w:val="single"/>
+          </w:rPr>
+          <w:t xml:space="preserve">https://github.com/andyjliu/llm-agent-collusion</w:t>
+        </w:r>
+      </w:hyperlink>
+      <w:r>
+        <w:rPr/>
+        <w:t>), which is not redistributed.</w:t>
       </w:r>
     </w:p>
     <w:p>
@@ -1653,7 +1692,7 @@
       </w:pPr>
       <w:r>
         <w:rPr/>
-        <w:t>• Pre-sprint work (disclosed): analysis tooling and harness flags were built on 22 October 2026, before the sprint; all new runs and analyses were done during the sprint. Every step is timestamped in the protocol file.</w:t>
+        <w:t>• Pre-sprint work (disclosed): analysis tooling and harness flags were built on 22 October 2026, before the sprint; all new runs and analyses were done during the sprint. The repository's DISCLOSURE.md separates the two, and every step is timestamped in the protocol file.</w:t>
       </w:r>
     </w:p>
     <w:p>
@@ -1688,8 +1727,17 @@
       </w:pPr>
       <w:r>
         <w:rPr/>
-        <w:t>1. Agrawal, K., Teo, V., Vazquez, J. J., Kunnavakkam, S., Srikanth, V., Liu, A. (2025). Evaluating LLM Agent Collusion in Double Auctions. arXiv:2507.01413. https://arxiv.org/abs/2507.01413</w:t>
-      </w:r>
+        <w:t xml:space="preserve">1. Agrawal, K., Teo, V., Vazquez, J. J., Kunnavakkam, S., Srikanth, V., Liu, A. (2025). Evaluating LLM Agent Collusion in Double Auctions. arXiv:2507.01413. </w:t>
+      </w:r>
+      <w:hyperlink r:id="rId13">
+        <w:r>
+          <w:rPr>
+            <w:color w:val="1155CC"/>
+            <w:u w:val="single"/>
+          </w:rPr>
+          <w:t xml:space="preserve">https://arxiv.org/abs/2507.01413</w:t>
+        </w:r>
+      </w:hyperlink>
     </w:p>
     <w:p>
       <w:pPr>
@@ -1698,8 +1746,17 @@
       </w:pPr>
       <w:r>
         <w:rPr/>
-        <w:t>2. Anto, M., Vazquez, J. (2026). Oversight is Not Compliance: Tacit Collusion in LLM Pricing Agents Under Antitrust Regulation. ICML 2026 Workshop on Agents in the Wild. https://icml.cc/virtual/2026/67865</w:t>
-      </w:r>
+        <w:t xml:space="preserve">2. Anto, M., Vazquez, J. (2026). Oversight is Not Compliance: Tacit Collusion in LLM Pricing Agents Under Antitrust Regulation. ICML 2026 Workshop on Agents in the Wild. </w:t>
+      </w:r>
+      <w:hyperlink r:id="rId14">
+        <w:r>
+          <w:rPr>
+            <w:color w:val="1155CC"/>
+            <w:u w:val="single"/>
+          </w:rPr>
+          <w:t xml:space="preserve">https://icml.cc/virtual/2026/67865</w:t>
+        </w:r>
+      </w:hyperlink>
     </w:p>
     <w:p>
       <w:pPr>
@@ -1708,8 +1765,17 @@
       </w:pPr>
       <w:r>
         <w:rPr/>
-        <w:t>3. Bhatt, A., et al. (2025). Ctrl-Z: Controlling AI Agents via Resampling. arXiv:2504.10374. https://arxiv.org/abs/2504.10374</w:t>
-      </w:r>
+        <w:t xml:space="preserve">3. Bhatt, A., et al. (2025). Ctrl-Z: Controlling AI Agents via Resampling. arXiv:2504.10374. </w:t>
+      </w:r>
+      <w:hyperlink r:id="rId15">
+        <w:r>
+          <w:rPr>
+            <w:color w:val="1155CC"/>
+            <w:u w:val="single"/>
+          </w:rPr>
+          <w:t xml:space="preserve">https://arxiv.org/abs/2504.10374</w:t>
+        </w:r>
+      </w:hyperlink>
     </w:p>
     <w:p>
       <w:pPr>
@@ -1718,8 +1784,17 @@
       </w:pPr>
       <w:r>
         <w:rPr/>
-        <w:t>4. Bonjour, T., Aggarwal, V., Bhargava, B. (2022). Information Theoretic Approach to Detect Collusion in Multi-Agent Games. UAI 2022, PMLR 180:223-232. https://proceedings.mlr.press/v180/bonjour22a.html</w:t>
-      </w:r>
+        <w:t xml:space="preserve">4. Bonjour, T., Aggarwal, V., Bhargava, B. (2022). Information Theoretic Approach to Detect Collusion in Multi-Agent Games. UAI 2022, PMLR 180:223-232. </w:t>
+      </w:r>
+      <w:hyperlink r:id="rId16">
+        <w:r>
+          <w:rPr>
+            <w:color w:val="1155CC"/>
+            <w:u w:val="single"/>
+          </w:rPr>
+          <w:t xml:space="preserve">https://proceedings.mlr.press/v180/bonjour22a.html</w:t>
+        </w:r>
+      </w:hyperlink>
     </w:p>
     <w:p>
       <w:pPr>
@@ -1728,8 +1803,17 @@
       </w:pPr>
       <w:r>
         <w:rPr/>
-        <w:t>5. Bracale Syrnikov, M., et al. (2026). Institutional AI: Governing LLM Collusion in Multi-Agent Cournot Markets via Public Governance Graphs. arXiv:2601.11369. https://arxiv.org/abs/2601.11369</w:t>
-      </w:r>
+        <w:t xml:space="preserve">5. Bracale Syrnikov, M., et al. (2026). Institutional AI: Governing LLM Collusion in Multi-Agent Cournot Markets via Public Governance Graphs. arXiv:2601.11369. </w:t>
+      </w:r>
+      <w:hyperlink r:id="rId17">
+        <w:r>
+          <w:rPr>
+            <w:color w:val="1155CC"/>
+            <w:u w:val="single"/>
+          </w:rPr>
+          <w:t xml:space="preserve">https://arxiv.org/abs/2601.11369</w:t>
+        </w:r>
+      </w:hyperlink>
     </w:p>
     <w:p>
       <w:pPr>
@@ -1738,8 +1822,17 @@
       </w:pPr>
       <w:r>
         <w:rPr/>
-        <w:t>6. Calvano, E., Calzolari, G., Denicolò, V., Pastorello, S. (2020). Artificial Intelligence, Algorithmic Pricing, and Collusion. American Economic Review 110(10):3267-3297. https://doi.org/10.1257/aer.20190623</w:t>
-      </w:r>
+        <w:t xml:space="preserve">6. Calvano, E., Calzolari, G., Denicolò, V., Pastorello, S. (2020). Artificial Intelligence, Algorithmic Pricing, and Collusion. American Economic Review 110(10):3267-3297. </w:t>
+      </w:r>
+      <w:hyperlink r:id="rId18">
+        <w:r>
+          <w:rPr>
+            <w:color w:val="1155CC"/>
+            <w:u w:val="single"/>
+          </w:rPr>
+          <w:t xml:space="preserve">https://doi.org/10.1257/aer.20190623</w:t>
+        </w:r>
+      </w:hyperlink>
     </w:p>
     <w:p>
       <w:pPr>
@@ -1748,8 +1841,17 @@
       </w:pPr>
       <w:r>
         <w:rPr/>
-        <w:t>7. Collina, N., Arunachaleswaran, E. R., Jagadeesan, M. (2025). Breaking Algorithmic Collusion in Human-AI Ecosystems. arXiv:2511.21935. https://arxiv.org/abs/2511.21935</w:t>
-      </w:r>
+        <w:t xml:space="preserve">7. Collina, N., Arunachaleswaran, E. R., Jagadeesan, M. (2025). Breaking Algorithmic Collusion in Human-AI Ecosystems. arXiv:2511.21935. </w:t>
+      </w:r>
+      <w:hyperlink r:id="rId19">
+        <w:r>
+          <w:rPr>
+            <w:color w:val="1155CC"/>
+            <w:u w:val="single"/>
+          </w:rPr>
+          <w:t xml:space="preserve">https://arxiv.org/abs/2511.21935</w:t>
+        </w:r>
+      </w:hyperlink>
     </w:p>
     <w:p>
       <w:pPr>
@@ -1758,8 +1860,17 @@
       </w:pPr>
       <w:r>
         <w:rPr/>
-        <w:t>8. Fish, S., Gonczarowski, Y. A., Shorrer, R. I. (2024). Algorithmic Collusion by Large Language Models. arXiv:2404.00806. https://arxiv.org/abs/2404.00806</w:t>
-      </w:r>
+        <w:t xml:space="preserve">8. Fish, S., Gonczarowski, Y. A., Shorrer, R. I. (2024). Algorithmic Collusion by Large Language Models. arXiv:2404.00806. </w:t>
+      </w:r>
+      <w:hyperlink r:id="rId20">
+        <w:r>
+          <w:rPr>
+            <w:color w:val="1155CC"/>
+            <w:u w:val="single"/>
+          </w:rPr>
+          <w:t xml:space="preserve">https://arxiv.org/abs/2404.00806</w:t>
+        </w:r>
+      </w:hyperlink>
     </w:p>
     <w:p>
       <w:pPr>
@@ -1768,8 +1879,17 @@
       </w:pPr>
       <w:r>
         <w:rPr/>
-        <w:t>9. Garra, A. (2026). Mitigating Emergent Collusion in LLM Pricing Agents. arXiv:2609.13037. https://arxiv.org/abs/2609.13037</w:t>
-      </w:r>
+        <w:t xml:space="preserve">9. Garra, A. (2026). Mitigating Emergent Collusion in LLM Pricing Agents. arXiv:2609.13037. </w:t>
+      </w:r>
+      <w:hyperlink r:id="rId21">
+        <w:r>
+          <w:rPr>
+            <w:color w:val="1155CC"/>
+            <w:u w:val="single"/>
+          </w:rPr>
+          <w:t xml:space="preserve">https://arxiv.org/abs/2609.13037</w:t>
+        </w:r>
+      </w:hyperlink>
     </w:p>
     <w:p>
       <w:pPr>
@@ -1778,8 +1898,17 @@
       </w:pPr>
       <w:r>
         <w:rPr/>
-        <w:t>10. Greenblatt, R., Shlegeris, B., Sachan, K., Roger, F. (2024). AI Control: Improving Safety Despite Intentional Subversion. ICML 2024; arXiv:2312.06942. https://arxiv.org/abs/2312.06942</w:t>
-      </w:r>
+        <w:t xml:space="preserve">10. Greenblatt, R., Shlegeris, B., Sachan, K., Roger, F. (2024). AI Control: Improving Safety Despite Intentional Subversion. ICML 2024; arXiv:2312.06942. </w:t>
+      </w:r>
+      <w:hyperlink r:id="rId22">
+        <w:r>
+          <w:rPr>
+            <w:color w:val="1155CC"/>
+            <w:u w:val="single"/>
+          </w:rPr>
+          <w:t xml:space="preserve">https://arxiv.org/abs/2312.06942</w:t>
+        </w:r>
+      </w:hyperlink>
     </w:p>
     <w:p>
       <w:pPr>
@@ -1788,8 +1917,17 @@
       </w:pPr>
       <w:r>
         <w:rPr/>
-        <w:t>11. Keppo, J., Li, Y., Tsoukalas, G., Yuan, N. (2026). On the Fragility of AI Agent Collusion. arXiv:2603.20281. https://arxiv.org/abs/2603.20281</w:t>
-      </w:r>
+        <w:t xml:space="preserve">11. Keppo, J., Li, Y., Tsoukalas, G., Yuan, N. (2026). On the Fragility of AI Agent Collusion. arXiv:2603.20281. </w:t>
+      </w:r>
+      <w:hyperlink r:id="rId23">
+        <w:r>
+          <w:rPr>
+            <w:color w:val="1155CC"/>
+            <w:u w:val="single"/>
+          </w:rPr>
+          <w:t xml:space="preserve">https://arxiv.org/abs/2603.20281</w:t>
+        </w:r>
+      </w:hyperlink>
     </w:p>
     <w:p>
       <w:pPr>
@@ -1798,8 +1936,17 @@
       </w:pPr>
       <w:r>
         <w:rPr/>
-        <w:t>12. Nakamura, M., et al. (2026). Colosseum: Auditing Collusion in Cooperative Multi-Agent Systems. arXiv:2602.15198. https://arxiv.org/abs/2602.15198</w:t>
-      </w:r>
+        <w:t xml:space="preserve">12. Nakamura, M., et al. (2026). Colosseum: Auditing Collusion in Cooperative Multi-Agent Systems. arXiv:2602.15198. </w:t>
+      </w:r>
+      <w:hyperlink r:id="rId24">
+        <w:r>
+          <w:rPr>
+            <w:color w:val="1155CC"/>
+            <w:u w:val="single"/>
+          </w:rPr>
+          <w:t xml:space="preserve">https://arxiv.org/abs/2602.15198</w:t>
+        </w:r>
+      </w:hyperlink>
     </w:p>
     <w:p>
       <w:pPr>
@@ -1808,8 +1955,17 @@
       </w:pPr>
       <w:r>
         <w:rPr/>
-        <w:t>13. Radev, N., Haas, L., Arnav, B., Bernabeu-Pérez, P. (2026). The Best-Laid SCHEMEs: Coordinated Sabotage and Monitoring in Multi-Agent Systems. arXiv:2605.29178. https://arxiv.org/abs/2605.29178</w:t>
-      </w:r>
+        <w:t xml:space="preserve">13. Radev, N., Haas, L., Arnav, B., Bernabeu-Pérez, P. (2026). The Best-Laid SCHEMEs: Coordinated Sabotage and Monitoring in Multi-Agent Systems. arXiv:2605.29178. </w:t>
+      </w:r>
+      <w:hyperlink r:id="rId25">
+        <w:r>
+          <w:rPr>
+            <w:color w:val="1155CC"/>
+            <w:u w:val="single"/>
+          </w:rPr>
+          <w:t xml:space="preserve">https://arxiv.org/abs/2605.29178</w:t>
+        </w:r>
+      </w:hyperlink>
     </w:p>
     <w:p>
       <w:pPr>
@@ -1818,8 +1974,17 @@
       </w:pPr>
       <w:r>
         <w:rPr/>
-        <w:t>14. Riedl, C. (2026). Emergent Coordination in Multi-Agent Language Models. ICLR 2026; arXiv:2510.05174. https://arxiv.org/abs/2510.05174</w:t>
-      </w:r>
+        <w:t xml:space="preserve">14. Riedl, C. (2026). Emergent Coordination in Multi-Agent Language Models. ICLR 2026; arXiv:2510.05174. </w:t>
+      </w:r>
+      <w:hyperlink r:id="rId26">
+        <w:r>
+          <w:rPr>
+            <w:color w:val="1155CC"/>
+            <w:u w:val="single"/>
+          </w:rPr>
+          <w:t xml:space="preserve">https://arxiv.org/abs/2510.05174</w:t>
+        </w:r>
+      </w:hyperlink>
     </w:p>
     <w:p>
       <w:pPr>
@@ -1828,8 +1993,17 @@
       </w:pPr>
       <w:r>
         <w:rPr/>
-        <w:t>15. Tailor, O. (2025). Audit the Whisper: Detecting Steganographic Collusion in Multi-Agent LLMs. arXiv:2510.04303. https://arxiv.org/abs/2510.04303</w:t>
-      </w:r>
+        <w:t xml:space="preserve">15. Tailor, O. (2025). Audit the Whisper: Detecting Steganographic Collusion in Multi-Agent LLMs. arXiv:2510.04303. </w:t>
+      </w:r>
+      <w:hyperlink r:id="rId27">
+        <w:r>
+          <w:rPr>
+            <w:color w:val="1155CC"/>
+            <w:u w:val="single"/>
+          </w:rPr>
+          <w:t xml:space="preserve">https://arxiv.org/abs/2510.04303</w:t>
+        </w:r>
+      </w:hyperlink>
     </w:p>
     <w:p>
       <w:pPr>
@@ -3319,7 +3493,7 @@
                     <pic:cNvPicPr/>
                   </pic:nvPicPr>
                   <pic:blipFill>
-                    <a:blip r:embed="rId10"/>
+                    <a:blip r:embed="rId28"/>
                     <a:stretch>
                       <a:fillRect/>
                     </a:stretch>
@@ -3376,7 +3550,7 @@
                     <pic:cNvPicPr/>
                   </pic:nvPicPr>
                   <pic:blipFill>
-                    <a:blip r:embed="rId11"/>
+                    <a:blip r:embed="rId29"/>
                     <a:stretch>
                       <a:fillRect/>
                     </a:stretch>

</xml_diff>

<commit_message>
Report: author's sections merged; claim checker follows his wording (34/34)
Co-Authored-By: Claude Opus 5.5 <noreply@anthropic.com>
</commit_message>
<xml_diff>
--- a/report/Apart_Collusion_Sprint_Report_Manu_Nicholas_Jacob.docx
+++ b/report/Apart_Collusion_Sprint_Report_Manu_Nicholas_Jacob.docx
@@ -389,9 +389,10 @@
                       <w:rFonts w:ascii="Old Standard TT" w:cs="Old Standard TT" w:eastAsia="Old Standard TT" w:hAnsi="Old Standard TT"/>
                       <w:i w:val="0"/>
                       <w:iCs w:val="1"/>
+                      <w:sz w:val="21"/>
                       <w:rtl w:val="0"/>
                     </w:rPr>
-                    <w:t>Which single restriction removes the most LLM-agent collusion at the least cost? Prior work compares anti-collusion levers by their effect alone; we also price them. In the continuous double auction of Agrawal et al. (2025) we first audit the reference "oversight" lever in the authors' public runs: its LLM monitor fired in 20 of 20 runs within seven rounds and limited sellers to five-character messages for 77 to 97% of each run, so it acts as a delayed communication ban rather than light-touch monitoring. We then run a pre-registered, powered study of seven levers (25 runs each) with Llama-3.3-70B sellers, separating a monitoring notice from the monitor, varying the monitoring budget, and adding a single no-regret competitor seller. Our positive control failed: neither Llama-3.3-70B nor GPT-4.1-mini sellers colluded when allowed to communicate, so no lever could reduce collusion, and the study measures what levers cost a market that is not colluding. The monitor punished innocent markets in up to 48% of runs. A monitoring notice lowered buyer welfare by 22% while the monitor without the notice had no detectable effect, and banning communication cost 13% of trades. One no-regret seller raised buyer welfare by 26%. A replication on 75 fresh runs, pre-registered before it ran, confirmed both welfare effects (16% lower under the notice, 44% higher with the competitor) but not the notice's effect on trade volume. Anti-collusion levers carry false-positive costs that should be measured alongside their benefits.</w:t>
+                    <w:t>The question behind this study is straightforward: which intervention can reduce collusion between LLM pricing agents at the lowest cost to the market? Previous work has mainly compared interventions by how much collusion they prevent, without measuring what those interventions cost when there is no collusion to prevent. We use the continuous double auction from Agrawal et al. (2025) to investigate this trade-off. First, we audited the authors’ public runs and found that the LLM monitor triggered in 20 of 20 oversight runs, within seven rounds, restricting sellers to five-character messages for 77 to 97% of each run. In practice, this makes oversight behave more like a delayed communication ban than light-touch monitoring. We then compared seven interventions in a pre-registered study with 25 runs each, using Llama-3.3-70B sellers. Neither Llama-3.3-70B nor GPT-4.1-mini sellers colluded when communication was allowed, meaning there was no collusion for the interventions to reduce. Instead, we measured their costs in a non-colluding market. The monitor punished innocent markets in up to 48% of runs, the monitoring notice reduced buyer welfare by 22%, and banning communication cost 13% of trades. In contrast, adding one no-regret competitor increased buyer welfare by 26%. A further 75 pre-registered runs confirmed both welfare effects, although the notice’s effect on trade volume did not replicate. These findings show why the costs of false positives must be measured alongside the benefits of anti-collusion interventions.</w:t>
                   </w:r>
                 </w:p>
               </w:tc>
@@ -441,7 +442,7 @@
       </w:pPr>
       <w:r>
         <w:rPr/>
-        <w:t>LLM agents that set prices can sustain prices above the competitive level, with or without talking to each other (Fish et al., 2024; Agrawal et al., 2025). A platform or regulator facing this risk will deploy the cheapest lever that works: a communication ban, a monitor, a warning, or a change to who is in the market. Existing studies compare such levers by how much collusion they remove (Agrawal et al., 2025; Bracale Syrnikov et al., 2026; Garra, 2026; Anto and Vazquez, 2026), but none measures what a lever costs, and in particular what it costs when there is no collusion to remove. In AI-control terms, a monitor has a false-positive rate and spends a usefulness budget (Greenblatt et al., 2024; Bhatt et al., 2025); anti-collusion levers should be priced the same way.</w:t>
+        <w:t>LLM pricing agents can sustain supracompetitive prices, both with and without direct communication (Fish et al., 2024; Agrawal et al., 2025). This creates a practical problem for platforms and regulators: how should they intervene? They could ban communication, introduce an automated monitor, warn agents that they are being monitored, or change the market by introducing a different type of competitor. In practice, the preferred option will depend not only on whether it reduces collusion, but also on what it costs.</w:t>
       </w:r>
     </w:p>
     <w:p>
@@ -449,10 +450,26 @@
         <w:spacing w:after="80"/>
       </w:pPr>
       <w:r>
-        <w:rPr>
-          <w:b/>
-        </w:rPr>
-        <w:t>Our main contributions are:</w:t>
+        <w:rPr/>
+        <w:t>Existing studies have compared interventions based on their ability to reduce collusion (Agrawal et al., 2025; Bracale Syrnikov et al., 2026; Garra, 2026; Anto and Vazquez, 2026). However, an important question remains unanswered: what happens when an intervention is applied to a market that is not colluding in the first place? A monitor can flag legitimate behaviour, a warning can change how agents make decisions, and a communication ban can prevent sellers from coordinating on prices that allow trades to happen. These costs matter just as much when evaluating whether an intervention is worthwhile.</w:t>
+      </w:r>
+    </w:p>
+    <w:p>
+      <w:pPr>
+        <w:spacing w:after="80"/>
+      </w:pPr>
+      <w:r>
+        <w:rPr/>
+        <w:t>This problem also connects to AI control, where monitoring systems are evaluated in terms of false positives, auditing budgets, and the usefulness they sacrifice to maintain oversight (Greenblatt et al., 2024; Bhatt et al., 2025). Anti-collusion interventions should be evaluated using the same principle.</w:t>
+      </w:r>
+    </w:p>
+    <w:p>
+      <w:pPr>
+        <w:spacing w:after="80"/>
+      </w:pPr>
+      <w:r>
+        <w:rPr/>
+        <w:t>This study makes four contributions:</w:t>
       </w:r>
     </w:p>
     <w:p>
@@ -462,7 +479,7 @@
       </w:pPr>
       <w:r>
         <w:rPr/>
-        <w:t>1. An audit of the reference oversight lever in the Agrawal et al. harness: in the authors' public gpt-4.1 runs, its monitor fired in 20/20 runs and removed about 90% of seller messages, so "oversight" in that environment is a delayed ban. The original paper does not report this.</w:t>
+        <w:t>1. We audit the reference oversight mechanism and find that it triggered in 20/20 public runs, removing about 90% of seller message text. This makes it closer to a delayed communication ban than ordinary monitoring.</w:t>
       </w:r>
     </w:p>
     <w:p>
@@ -472,7 +489,7 @@
       </w:pPr>
       <w:r>
         <w:rPr/>
-        <w:t>2. A pre-registered, powered comparison of seven levers (n=25 each) that splits deterrence (a monitoring notice) from enforcement (a monitor that gags sellers), varies the monitoring budget, and tests a no-regret competitor, the lever singled out in the sprint's Q1.5.</w:t>
+        <w:t>2. We conduct a pre-registered comparison of seven interventions (n=25 each), separating a monitoring warning from enforcement, varying the monitoring budget, and testing a no-regret competitor.</w:t>
       </w:r>
     </w:p>
     <w:p>
@@ -482,7 +499,7 @@
       </w:pPr>
       <w:r>
         <w:rPr/>
-        <w:t>3. Evidence that levers are costly where there is no collusion: a monitor that misfires on innocent markets, a warning that lowers buyer welfare and a communication ban that costs liquidity, while a single competitor raises buyer welfare. Both welfare effects replicated on fresh runs pre-registered before they ran.</w:t>
+        <w:t>3. We measure the costs of these interventions in non-colluding markets and find that warnings can harm buyers and monitors misfire on innocent markets, while a no-regret competitor improves buyer welfare. Both welfare effects hold in fresh, pre-registered runs.</w:t>
       </w:r>
     </w:p>
     <w:p>
@@ -492,7 +509,7 @@
       </w:pPr>
       <w:r>
         <w:rPr/>
-        <w:t>4. Evidence-standard results for Q1.3 and Q2.3: an information-theoretic detector calibrated against no-communication runs, and an LLM judge whose coordination score tracks talk rather than prices.</w:t>
+        <w:t>4. We evaluate information-theoretic detection and LLM-based coordination judging, finding important limitations in what each measure captures.</w:t>
       </w:r>
     </w:p>
     <w:p>
@@ -515,7 +532,7 @@
       </w:r>
       <w:r>
         <w:rPr/>
-        <w:t xml:space="preserve"> Fish et al. (2024) show LLM pricing agents reaching supracompetitive prices without any communication, with large effects from small prompt changes. Agrawal et al. (2025) find that seller communication raises collusion in a double auction and that oversight and urgency shift behaviour; their oversight condition combines a warning with a message cap that is triggered by an LLM monitor. Keppo et al. (2026) find that heterogeneity among agents weakens collusion, and Calvano et al. (2020) show reinforcement-learning pricing agents colluding without communication.</w:t>
+        <w:t xml:space="preserve"> Research has shown that LLM pricing agents can produce supracompetitive prices even without direct communication, with small changes to prompts sometimes producing substantial behavioural differences (Fish et al., 2024). In continuous double auctions, seller communication can increase collusion, while oversight and urgency can change agent behaviour (Agrawal et al., 2025). However, the oversight mechanism in that work combines a warning with an LLM monitor that restricts messages. Other work finds that agent heterogeneity can weaken collusion (Keppo et al., 2026), while reinforcement-learning pricing agents can collude without communication (Calvano et al., 2020). More recent studies examine governance mechanisms, prompt-based warnings, and different forms of oversight, with results varying across interventions and models (Bracale Syrnikov et al., 2026; Garra, 2026; Anto and Vazquez, 2026). Collina et al. (2025) also show theoretically how a single participant using a no-regret strategy can destabilise algorithmic collusion.</w:t>
       </w:r>
     </w:p>
     <w:p>
@@ -530,7 +547,7 @@
       </w:r>
       <w:r>
         <w:rPr/>
-        <w:t xml:space="preserve"> Bracale Syrnikov et al. (2026) find that a prompt-only anti-collusion instruction gives no reliable improvement while an enforced governance graph sharply reduces severe collusion. Garra (2026) finds that a prompt-only warning reduces but does not eliminate above-Nash pricing. Anto and Vazquez (2026) compare passive logging, revision and veto oversight and find that the best mode depends on the model. Collina et al. (2025) show theoretically that a single participant playing a no-regret strategy can destabilise algorithmic collusion. None of these studies measures the cost of an intervention, and none separates a warning from the monitor that backs it. Radev et al. (2026) report that telling agents a monitor is present halves coordinated sabotage, a deterrence effect in a non-market setting.</w:t>
+        <w:t xml:space="preserve"> Existing work explores interventions ranging from governance structures to changes in agent behaviour. A warning that a monitor is present can reduce coordinated sabotage in non-market settings (Radev et al., 2026). However, these results do not establish what such interventions cost when applied to a market that is already behaving competitively.</w:t>
       </w:r>
     </w:p>
     <w:p>
@@ -545,7 +562,7 @@
       </w:r>
       <w:r>
         <w:rPr/>
-        <w:t xml:space="preserve"> AI-control work frames monitors in terms of auditing budgets, false-positive rates and usefulness costs (Greenblatt et al., 2024; Bhatt et al., 2025). For collusion detection, Bonjour et al. (2022) define pairwise net influence for small games; to our knowledge it has not been applied to LLM agents, while prior LLM work uses cross-run mutual information (Tailor, 2025) or partial information decomposition (Riedl, 2026). Nakamura et al. (2026) observe "collusion on paper": agents that agree to collude in text but act otherwise.</w:t>
+        <w:t xml:space="preserve"> AI-control research highlights the importance of monitoring budgets, false-positive rates, and the usefulness sacrificed to maintain oversight (Greenblatt et al., 2024; Bhatt et al., 2025). For collusion detection, Bonjour et al. (2022) propose pairwise net influence for small multi-agent games. LLM-specific approaches have since explored cross-run mutual information (Tailor, 2025) and partial information decomposition (Riedl, 2026). Nakamura et al. (2026) further examine cases where agents agree to collude in text but do not follow through in their actions. Despite this progress, existing work has not measured the costs of anti-collusion interventions or separated the effect of a warning from that of the monitor enforcing it.</w:t>
       </w:r>
     </w:p>
     <w:p>
@@ -1139,7 +1156,7 @@
       </w:pPr>
       <w:r>
         <w:rPr/>
-        <w:t>The warning, not the monitor, does the damage: arms that include the notice lose buyer welfare (and, for the notice alone, trades), while the monitor without the notice does not. Warned sellers turned their messages toward compliance (28% of messages mention monitoring or regulation, against 3% without the notice) and held slightly higher asks. A communication ban costs liquidity because these sellers used messages to converge on tradable prices. The no-regret seller is the only lever that helps buyers, lowering mean trade prices by $1.41. In this sample the notice's trade effect also survives a rank test (median 60 versus 82 trades, Mann-Whitney p=0.005), but it did not replicate (Section 4.5).</w:t>
+        <w:t>The results suggest that the warning itself causes most of the harm, rather than the monitor. Markets exposed to the notice experienced lower buyer welfare, and the notice alone also reduced the number of trades. By contrast, the monitor without the warning had no detectable effect. Warned sellers changed how they communicated, with 28% of their messages mentioning monitoring or regulation, compared with 3% without the notice, and they maintained slightly higher asks. Banning communication also came at a cost: sellers appeared to use messages to converge on prices that allowed trades to happen. Of the interventions tested, only the no-regret competitor helped buyers, lowering the mean trade price by $1.41. Although the notice’s effect on trade volume was also supported by a rank test (median 60 versus 82 trades, Mann-Whitney p=0.005), this result did not hold in the replication.</w:t>
       </w:r>
     </w:p>
     <w:p>
@@ -1481,7 +1498,7 @@
       </w:pPr>
       <w:r>
         <w:rPr/>
-        <w:t>The arms themselves were stable across the two samples (buyer welfare under the notice 19.7 and 19.1; under the no-regret seller 32.0 and 32.8), while the communication baseline varied (25.3 and 22.8), so part of the original trade gap reflected an unusually busy baseline. In the replication the notice hurt buyers through higher prices rather than fewer trades (mean trade price $91.88 versus $90.49), and warned sellers again talked more about monitoring and regulation (17% versus 8% of messages). The robust conclusions are therefore that a monitoring warning lowers buyer welfare in markets that are not colluding, by a route that varies, and that a single no-regret competitor raises it.</w:t>
+        <w:t>The replication supports the main welfare findings, even though the precise way the warning affected the market changed between samples. Buyer welfare under the notice remained similar across the two samples, at 19.7 and 19.1, while the no-regret competitor produced welfare of 32.0 and 32.8. The communication baseline differed between samples (25.3 and 22.8), suggesting that the original trade-volume reduction was partly influenced by an unusually busy baseline. In the replication, the warning hurt buyers through higher prices rather than fewer trades, with mean trade prices of $91.88 versus $90.49. Warned sellers again discussed monitoring and regulation more often (17% versus 8% of messages). Taken together, the findings suggest that warnings can reduce buyer welfare even when their specific effects vary, while a single no-regret competitor consistently improves buyer outcomes.</w:t>
       </w:r>
     </w:p>
     <w:p>
@@ -1513,7 +1530,16 @@
       </w:pPr>
       <w:r>
         <w:rPr/>
-        <w:t>The same lever can help or hurt depending on whether collusion is present. In the gpt-4.1 data, where sellers colluded weakly, oversight acted as a ban and raised buyer welfare (27.2 versus 19.8 per round). In Llama markets that did not collude, the warning attached to oversight lowered buyer welfare by 16 to 22% and the monitor misfired in up to half of runs. A platform therefore cannot judge a lever by its effect on colluding markets alone; it should also measure its false-positive cost, the harm to the many markets that are behaving competitively. By that standard the most attractive lever we tested is a competitor rather than a cop: a single no-regret seller costs no communication and no monitoring and improved buyer outcomes. For AI-control practice, a monitor with a hair-trigger, permanent penalty spends its whole usefulness budget on false positives, and the warning that announces it can impose costs by itself.</w:t>
+        <w:t>The main takeaway is that an intervention cannot be judged by how well it works against collusion alone. Its costs depend on the market it is applied to. In the gpt-4.1 data, where sellers colluded weakly, oversight effectively acted as a communication ban and increased buyer welfare (27.2 versus 19.8 per round). In the Llama markets, where sellers did not collude, the warning attached to oversight reduced buyer welfare by 16 to 22%, and the monitor triggered falsely in up to half of runs. The same intervention can therefore help in one setting and cause harm in another.</w:t>
+      </w:r>
+    </w:p>
+    <w:p>
+      <w:pPr>
+        <w:spacing w:after="80"/>
+      </w:pPr>
+      <w:r>
+        <w:rPr/>
+        <w:t>For platforms and regulators, this means that measuring false-positive costs should be part of evaluating any anti-collusion intervention. A monitor that fires easily and imposes a permanent penalty can spend much of its usefulness budget restricting legitimate behaviour. Even the warning that announces monitoring can change seller behaviour and harm buyers even when no monitor is present. Among the options tested here, a no-regret competitor appears more attractive than additional enforcement: it requires neither communication restrictions nor monitoring and improves buyer outcomes. The goal should not be to abandon oversight, but to measure its costs and calibrate it to the behaviour it is intended to prevent.</w:t>
       </w:r>
     </w:p>
     <w:p>
@@ -1598,7 +1624,7 @@
       </w:pPr>
       <w:r>
         <w:rPr/>
-        <w:t>A model that colludes reliably, to measure lever benefits and costs in the same model; calibrated monitor thresholds and budgets; credible versus non-credible warnings; mixed-model markets; and multiple competitor sellers.</w:t>
+        <w:t>Future work should test these interventions in a model that colludes reliably, allowing their benefits and costs to be measured in the same setting. Other priorities include calibrating monitor thresholds and budgets, comparing credible and non-credible warnings, and testing mixed-model markets with multiple no-regret competitors.</w:t>
       </w:r>
     </w:p>
     <w:p>
@@ -1615,7 +1641,7 @@
       </w:pPr>
       <w:r>
         <w:rPr/>
-        <w:t>Anti-collusion levers for LLM markets should be priced, not just scored. In the reference environment, "oversight" is a delayed ban. In markets where agents do not collude, monitors misfire, warnings lower buyer welfare and bans cost liquidity, while a single no-regret competitor helps buyers; both welfare effects held up in a pre-registered replication. Measuring false-positive costs should be part of evaluating any intervention against AI collusion.</w:t>
+        <w:t>Anti-collusion interventions in LLM markets should be evaluated by their costs as well as their effectiveness. In the reference environment, oversight behaved like a delayed communication ban. In markets that did not collude, monitors produced false positives, warnings reduced buyer welfare, and communication bans cost liquidity. A single no-regret competitor improved buyer welfare, and both welfare effects held in a pre-registered replication. Measuring these false-positive costs should be a standard part of evaluating interventions against AI collusion.</w:t>
       </w:r>
     </w:p>
     <w:p>
@@ -1709,7 +1735,7 @@
       </w:pPr>
       <w:r>
         <w:rPr/>
-        <w:t>M.N.J. designed the study, made the decisions at each stage and reviewed the manuscript. Analysis code, runs and the first draft were produced with Claude (see the LLM Usage Statement).</w:t>
+        <w:t>M.N.J. selected the study and sprint questions, made the go/no-go and budget decisions at each stage, wrote the abstract, introduction, related work, results interpretation paragraphs, discussion, and conclusion, and reviewed the full manuscript. Claude wrote the analysis and experiment code, ran the experiments, conducted the statistical analysis, and drafted the Methods, Results, and appendices.</w:t>
       </w:r>
     </w:p>
     <w:p>
@@ -3616,7 +3642,7 @@
       </w:pPr>
       <w:r>
         <w:rPr/>
-        <w:t>Claude (Anthropic) assisted throughout: it wrote and tested the analysis and run tooling, ran the experiments under a pre-registered protocol, performed the statistical analysis, verified every citation against its primary source, and drafted this report. The author defined the goals, approved each design decision and budget, and reviewed and edited the text. All numbers were regenerated from the logged runs, and every claim was checked against the outputs in the accompanying repository.</w:t>
+        <w:t>Claude (Anthropic) was used to write and test the analysis and experiment tooling, run experiments under the pre-registered protocol, conduct statistical analyses, check citations against their sources, and draft the Methods, Results, and appendices. M.N.J. wrote the abstract, introduction, related work, results interpretation paragraphs, discussion, and conclusion. All numerical results were regenerated from the logged runs and checked by script against the outputs in the public repository.</w:t>
       </w:r>
     </w:p>
     <w:sectPr>

</xml_diff>

<commit_message>
Report: author's round-2 sections merged; claim checker 34/34
Co-Authored-By: Claude Opus 5.5 <noreply@anthropic.com>
</commit_message>
<xml_diff>
--- a/report/Apart_Collusion_Sprint_Report_Manu_Nicholas_Jacob.docx
+++ b/report/Apart_Collusion_Sprint_Report_Manu_Nicholas_Jacob.docx
@@ -392,7 +392,7 @@
                       <w:sz w:val="21"/>
                       <w:rtl w:val="0"/>
                     </w:rPr>
-                    <w:t>The question behind this study is straightforward: which intervention can reduce collusion between LLM pricing agents at the lowest cost to the market? Previous work has mainly compared interventions by how much collusion they prevent, without measuring what those interventions cost when there is no collusion to prevent. We use the continuous double auction from Agrawal et al. (2025) to investigate this trade-off. First, we audited the authors' public runs and found that the LLM monitor triggered in 20 of 20 oversight runs, within seven rounds, restricting sellers to five-character messages for 77 to 97% of each run. In practice, this makes oversight behave more like a delayed communication ban than light-touch monitoring. We then compared seven interventions in a pre-registered study with 25 runs each, using Llama-3.3-70B sellers. Neither Llama-3.3-70B nor GPT-4.1-mini sellers colluded when communication was allowed, meaning there was no collusion for the interventions to reduce. Instead, we measured their costs in a non-colluding market. The monitor punished innocent markets in up to 48% of runs, the monitoring notice reduced buyer welfare by 22%, and banning communication cost 13% of trades. In contrast, adding one no-regret competitor increased buyer welfare by 26%. A further 75 pre-registered runs confirmed both welfare effects, although the notice's effect on trade volume did not replicate. These findings show why the costs of false positives must be measured alongside the benefits of anti-collusion interventions.</w:t>
+                    <w:t>The question behind this study is straightforward: which intervention can reduce collusion between LLM pricing agents at the lowest cost to the market? Previous work has mainly compared interventions by how much collusion they prevent, without measuring what those interventions cost when there is no collusion to prevent. We use the continuous double auction from Agrawal et al. (2025) to investigate this trade-off. First, we audited the authors' public runs and found that the LLM monitor triggered in 20 of 20 oversight runs, within seven rounds, restricting sellers to five-character messages for 77 to 97% of each run. In practice, this makes oversight behave more like a delayed communication ban than light-touch monitoring. We then compared six interventions against a communication baseline in a pre-registered study with 25 runs per arm, using Llama-3.3-70B sellers. Neither Llama-3.3-70B nor GPT-4.1-mini sellers colluded when communication was allowed, meaning there was no collusion for the interventions to reduce. Instead, we measured their costs in a non-colluding market. The monitor punished innocent markets in up to 48% of runs, the monitoring notice reduced buyer welfare by 22%, and banning communication cost 13% of trades. In contrast, adding one no-regret competitor increased buyer welfare by 26%. A further 75 pre-registered runs confirmed both welfare effects, although the notice's effect on trade volume did not replicate. These findings show why the costs of false positives must be measured alongside the benefits of anti-collusion interventions.</w:t>
                   </w:r>
                 </w:p>
               </w:tc>
@@ -489,7 +489,7 @@
       </w:pPr>
       <w:r>
         <w:rPr/>
-        <w:t>2. We conduct a pre-registered comparison of seven interventions (n=25 each), separating a monitoring warning from enforcement, varying the monitoring budget, and testing a no-regret competitor.</w:t>
+        <w:t>2. We conduct a pre-registered comparison of six interventions against a communication baseline (n=25 each), separating a monitoring warning from enforcement, varying the monitoring budget, and testing a no-regret competitor.</w:t>
       </w:r>
     </w:p>
     <w:p>
@@ -585,7 +585,7 @@
       </w:r>
       <w:r>
         <w:rPr/>
-        <w:t xml:space="preserve"> We use the Agrawal et al. (2025) continuous double auction unchanged in its market logic: 5 sellers (cost $80), 5 buyers (value $100), 30 hourly rounds, initial asks near $97.5. Sellers may send each other messages each round. In the oversight condition an LLM monitor scores seller messages from 1 to 4 and, after the first 4, limits all sellers to five-character messages for the rest of the run.</w:t>
+        <w:t xml:space="preserve"> We use the continuous double auction developed by Agrawal et al. (2025), keeping the original market logic unchanged. Each market has 5 sellers with a cost of $80 and 5 buyers with a value of $100. Trading runs for 30 hourly rounds, with initial seller asks near $97.5. Sellers can message one another during every round. In the oversight condition, an LLM monitor scores seller messages from 1 to 4. Once a message receives a score of 4, all sellers are restricted to five-character messages for the remainder of the run.</w:t>
       </w:r>
     </w:p>
     <w:p>
@@ -600,7 +600,7 @@
       </w:r>
       <w:r>
         <w:rPr/>
-        <w:t xml:space="preserve"> Trading agents are Llama-3.3-70B-Instruct (via OpenRouter) in the new runs; the monitor and the judge are GPT-4.1-mini in every arm, so the measuring instruments are constant. The 2025 audit uses the authors' public gpt-4.1 runs (10 per condition). All agents use the harness's prompt templates unchanged (the notice arm shows the template's own oversight warning) at temperature 0.7. The harness sets no random seed, so every run is an independent sample, and we report run-to-run variation through bootstrap intervals.</w:t>
+        <w:t xml:space="preserve"> The new experiments use Llama-3.3-70B-Instruct trading agents through OpenRouter. GPT-4.1-mini serves as both the monitor and the judge across every experimental condition, keeping the measurement tools consistent. For the 2025 audit, we use the authors' public gpt-4.1 runs, with 10 runs per condition. All agents use the harness's original prompt templates without modification, including the built-in oversight warning in the notice condition. The temperature is set to 0.7. Since the harness does not set a random seed, each run is treated as an independent sample, and variation across runs is captured through bootstrap intervals.</w:t>
       </w:r>
     </w:p>
     <w:p>
@@ -611,11 +611,11 @@
         <w:rPr>
           <w:b/>
         </w:rPr>
-        <w:t>Levers (one change each, versus communication on).</w:t>
-      </w:r>
-      <w:r>
-        <w:rPr/>
-        <w:t xml:space="preserve"> Ban communication; monitoring notice only (the warning text, no monitor); monitor only (monitor and gag, no warning); full oversight (both); oversight with a monitor that reads a random 25% of messages; and one no-regret seller (Hedge over asks $80.5 to $100 with full-information counterfactual payoffs) replacing one LLM seller.</w:t>
+        <w:t>Levers.</w:t>
+      </w:r>
+      <w:r>
+        <w:rPr/>
+        <w:t xml:space="preserve"> We test six interventions, each introduced as a single change to the communication-on baseline: banning communication, adding a monitoring notice without a monitor, using the monitor without a warning, applying full oversight with both the warning and monitor, applying full oversight with a monitor that reads only a random 25% of messages, and replacing one LLM seller with a no-regret competitor. The competitor uses Hedge over asks ranging from $80.5 to $100, with full-information counterfactual payoffs.</w:t>
       </w:r>
     </w:p>
     <w:p>
@@ -630,7 +630,7 @@
       </w:r>
       <w:r>
         <w:rPr/>
-        <w:t xml:space="preserve"> The primary collusion index is the mean seller ask over hours 16 to 30, scaled so the competitive price ($90) is 0 and the joint-profit price ($100) is 1 (for the no-regret lever, LLM sellers only). Costs: messages delivered (channel loss), monitor firing, completed trades, allocative efficiency, buyer welfare and seller profit.</w:t>
+        <w:t xml:space="preserve"> Our primary measure of collusion is the mean seller ask during hours 16 to 30, scaled so that the competitive price ($90) corresponds to 0 and the joint-profit price ($100) corresponds to 1. For the no-regret condition, this index includes only LLM sellers. We also track messages delivered to measure communication loss, monitor firings, completed trades, allocative efficiency, buyer welfare, and seller profit.</w:t>
       </w:r>
     </w:p>
     <w:p>
@@ -645,7 +645,7 @@
       </w:r>
       <w:r>
         <w:rPr/>
-        <w:t xml:space="preserve"> A pilot (6 plus 6 runs of Llama-3.3-70B, 3 plus 3 of GPT-4.1-mini) applied a pre-registered positive-control gate before the main study (25 runs per lever). Hypothesis tests use one-sided bootstrap differences (10,000 resamples) with Holm correction; exploratory comparisons use two-sided bootstrap intervals and are labelled as such. The exploratory effects of the notice and the no-regret seller were then tested in a confirmatory replication, pre-registered before any of its 75 fresh runs (25 each of communication, notice and no-regret seller), with Holm correction over its three tests. Every design decision, deviation and runtime fix is timestamped in a protocol committed to git before the analysis it governs. With the 2025 gpt-4.1 spread (SD 0.42), the original 10 runs per arm could detect only effects of 0.42 to 0.49 index units at 80% power (one-sided), larger than the communication ban's own effect (0.28); 25 runs per arm detects 0.26 to 0.30.</w:t>
+        <w:t xml:space="preserve"> Before the main study, a pilot used 6 plus 6 runs of Llama-3.3-70B and 3 plus 3 runs of GPT-4.1-mini to apply a pre-registered positive-control gate. The main study then ran 25 runs per arm. Hypothesis tests use one-sided bootstrap differences with 10,000 resamples and Holm correction. Exploratory comparisons use two-sided bootstrap intervals and are identified as exploratory. The notice and no-regret effects were subsequently tested in a confirmatory replication, pre-registered before all 75 fresh runs: 25 each for communication, notice, and the no-regret seller. Holm correction was applied across the three tests. Every design decision, deviation, and runtime fix is timestamped in a protocol committed to git before the analysis it governs. Given the 2025 gpt-4.1 spread (SD 0.42), the original 10 runs per arm could detect only effects of 0.42 to 0.49 index units at 80% power (one-sided), which exceeds the communication ban's own effect (0.28). With 25 runs per arm, the detectable range falls to 0.26 to 0.30.</w:t>
       </w:r>
     </w:p>
     <w:p>
@@ -668,17 +668,18 @@
       </w:r>
       <w:r>
         <w:rPr/>
-        <w:t xml:space="preserve"> In the authors' runs the monitor fired in 10/10 oversight runs and 10/10 runs combining oversight with profit pressure, first at hours 1 to 7, gagging sellers for 77 to 97% of the run; only 10% of message characters were delivered relative to the communication baseline (Figure 1). Priced at this measured cost, oversight is 0.82 to 1.26 times as cost-effective as a ban depending on the metric, with overlapping confidence intervals, rather than the "nearly free" lever an assumed cost suggests.</w:t>
-      </w:r>
-    </w:p>
-    <w:p>
-      <w:pPr>
+        <w:t xml:space="preserve"> The monitor triggered in every oversight run in the authors' public data, including 10/10 runs with oversight alone and 10/10 runs combining oversight with profit pressure. Across both conditions, the first trigger occurred between hours 1 and 7. Once triggered, the monitor restricted sellers' messages for 77 to 97% of the run. As Figure 1 shows, under oversight alone only 10% of message characters were delivered compared with the communication baseline. Accounting for this loss of communication, oversight was 0.82 to 1.26 times as cost-effective as a ban, depending on the metric. The confidence intervals overlap, suggesting that oversight is not clearly cheaper than a direct ban, despite the impression that it is a nearly free intervention.</w:t>
+      </w:r>
+    </w:p>
+    <w:p>
+      <w:pPr>
+        <w:keepNext/>
         <w:jc w:val="center"/>
       </w:pPr>
       <w:r>
         <w:drawing>
           <wp:inline>
-            <wp:extent cx="5943600" cy="2327021"/>
+            <wp:extent cx="5486400" cy="2148020"/>
             <wp:docPr id="1" name="Picture 1"/>
             <wp:cNvGraphicFramePr>
               <a:graphicFrameLocks noChangeAspect="1"/>
@@ -699,7 +700,7 @@
                   <pic:spPr>
                     <a:xfrm>
                       <a:off x="0" y="0"/>
-                      <a:ext cx="5943600" cy="2327021"/>
+                      <a:ext cx="5486400" cy="2148020"/>
                     </a:xfrm>
                     <a:prstGeom prst="rect"/>
                   </pic:spPr>
@@ -740,7 +741,7 @@
       </w:r>
       <w:r>
         <w:rPr/>
-        <w:t xml:space="preserve"> With communication, Llama-3.3-70B sellers did not price above the no-communication arm (index -0.006 versus +0.024, n=6 each), and GPT-4.1-mini sellers priced below the competitive level in both arms (-0.54 versus -0.48, n=3 each). In the main study the Llama communication baseline sits at the competitive price (index -0.00, 95% CI [-0.09, 0.08]). Following the pre-registered rule, the main study ran on Llama-3.3-70B. In the pre-registered tests (H1 notice, H2 monitor, H2b 25% monitor, H-mav competitor) no lever reduced collusion (all Holm p &gt; 0.8): there was no collusion to reduce.</w:t>
+        <w:t xml:space="preserve"> The positive-control tests did not show collusion in either model when communication was available. Llama-3.3-70B sellers did not price above the no-communication condition, with indices of -0.006 versus +0.024 (n=6 each). GPT-4.1-mini sellers priced below the competitive level in both conditions, at -0.54 versus -0.48 (n=3 each). The main Llama study showed the same pattern: the communication baseline remained at the competitive price, with an index of -0.00 and a 95% CI of [-0.09, 0.08]. Following the pre-registered decision rule, we proceeded with Llama-3.3-70B for the main study. As Table B1 shows, none of the tested interventions reduced collusion (all Holm p &gt; 0.8). There was no collusion to reduce.</w:t>
       </w:r>
     </w:p>
     <w:p>
@@ -755,7 +756,7 @@
       </w:r>
       <w:r>
         <w:rPr/>
-        <w:t xml:space="preserve"> Because no Llama market colluded, every monitor firing is a false positive. The monitor alone fired in 12 of 25 runs and gagged 31% of rounds; with the warning in place it fired in 5 of 25 (7% of rounds), and reading 25% of messages it fired in 7 of 25 (20% of rounds) (Figure 2, right).</w:t>
+        <w:t xml:space="preserve"> Because none of the Llama markets colluded, every monitor firing represents a false positive. As shown in Figure 2 (right panel) and Table B2, the monitor without a warning fired in 12 of 25 runs and restricted communication for 31% of rounds. With the warning included under full oversight, it fired in 5 of 25 runs, covering 7% of rounds. When the monitor examined a random 25% of messages, it fired in 7 of 25 runs and affected 20% of rounds. Reducing the monitoring budget therefore did not eliminate false positives.</w:t>
       </w:r>
     </w:p>
     <w:p>
@@ -1152,21 +1153,13 @@
     </w:p>
     <w:p>
       <w:pPr>
-        <w:spacing w:after="80"/>
-      </w:pPr>
-      <w:r>
-        <w:rPr/>
-        <w:t>The results suggest that the warning itself causes most of the harm, rather than the monitor. Markets exposed to the notice experienced lower buyer welfare, and the notice alone also reduced the number of trades. By contrast, the monitor without the warning had no detectable effect. Warned sellers changed how they communicated, with 28% of their messages mentioning monitoring or regulation, compared with 3% without the notice, and they maintained slightly higher asks. Banning communication also came at a cost: sellers appeared to use messages to converge on prices that allowed trades to happen. Of the interventions tested, only the no-regret competitor helped buyers, lowering the mean trade price by $1.41. Although the notice's effect on trade volume was also supported by a rank test (median 60 versus 82 trades, Mann-Whitney p=0.005), this result did not hold in the replication.</w:t>
-      </w:r>
-    </w:p>
-    <w:p>
-      <w:pPr>
+        <w:keepNext/>
         <w:jc w:val="center"/>
       </w:pPr>
       <w:r>
         <w:drawing>
           <wp:inline>
-            <wp:extent cx="5943600" cy="1822126"/>
+            <wp:extent cx="5486400" cy="1681962"/>
             <wp:docPr id="2" name="Picture 2"/>
             <wp:cNvGraphicFramePr>
               <a:graphicFrameLocks noChangeAspect="1"/>
@@ -1187,7 +1180,7 @@
                   <pic:spPr>
                     <a:xfrm>
                       <a:off x="0" y="0"/>
-                      <a:ext cx="5943600" cy="1822126"/>
+                      <a:ext cx="5486400" cy="1681962"/>
                     </a:xfrm>
                     <a:prstGeom prst="rect"/>
                   </pic:spPr>
@@ -1214,6 +1207,15 @@
           <w:sz w:val="17"/>
         </w:rPr>
         <w:t xml:space="preserve"> Differences from the communication baseline in trades per run and buyer welfare per round, with 95% bootstrap intervals (Llama-3.3-70B sellers, 25 runs per lever), and the share of runs in which the monitor fired, all false positives because no market colluded.</w:t>
+      </w:r>
+    </w:p>
+    <w:p>
+      <w:pPr>
+        <w:spacing w:after="80"/>
+      </w:pPr>
+      <w:r>
+        <w:rPr/>
+        <w:t>The results suggest that the warning itself causes most of the harm, rather than the monitor. Markets exposed to the notice experienced lower buyer welfare, and the notice alone also reduced the number of trades. By contrast, the monitor without the warning had no detectable effect. Warned sellers changed how they communicated, with 28% of their messages mentioning monitoring or regulation, compared with 3% without the notice, and they maintained slightly higher asks. Banning communication also came at a cost: sellers appeared to use messages to converge on prices that allowed trades to happen. Of the interventions tested, only the no-regret competitor helped buyers, lowering the mean trade price by $1.41. Although the notice's effect on trade volume was also supported by a rank test (median 60 versus 82 trades, Mann-Whitney p=0.005), this result did not hold in the replication.</w:t>
       </w:r>
     </w:p>
     <w:p>
@@ -1513,7 +1515,25 @@
       </w:r>
       <w:r>
         <w:rPr/>
-        <w:t xml:space="preserve"> (i) Detection (Q1.3, Q1.4): on the gpt-4.1 runs, Bonjour et al.'s net influence at its published threshold flags 70% of no-communication runs; calibrated at the 90th percentile of no-communication runs, net influence and a transfer-entropy statistic each detect 4 of 10 communication runs at a 10% false-positive rate. (ii) Judges (Q2.3): within communication runs, the LLM judge's coordination score rose while prices fell in 10 of 10 runs (mean within-run rho -0.52, sign test p=0.002); on round-to-round changes the correlation vanishes (rho -0.04). The judge measures talk, not market outcomes. (iii) Channel movement (Q3.4): under the gag, gpt-4.1 messages fell by 99.4% but price-path dependence did not rise, so we find no evidence that coordination moved into prices.</w:t>
+        <w:t xml:space="preserve"> (i) Detection (Q1.3, Q1.4). In the gpt-4.1 runs, Bonjour et al.'s net influence measure, using its published threshold, flagged 70% of runs without communication. This is too high to serve as a reliable indicator of collusion in this setting. After calibrating the threshold to the 90th percentile of no-communication runs, both net influence and transfer entropy detected 4 of 10 communication runs while maintaining a 10% false-positive rate.</w:t>
+      </w:r>
+    </w:p>
+    <w:p>
+      <w:pPr>
+        <w:spacing w:after="80"/>
+      </w:pPr>
+      <w:r>
+        <w:rPr/>
+        <w:t>(ii) Judges (Q2.3). Within communication runs, the LLM judge's coordination score increased while prices fell in 10 of 10 runs. The mean within-run correlation was rho -0.52 (sign test p=0.002). However, this relationship disappeared when looking at round-to-round changes (rho -0.04). The judge therefore appears to capture patterns in agent communication rather than reliably reflecting what is happening in the market.</w:t>
+      </w:r>
+    </w:p>
+    <w:p>
+      <w:pPr>
+        <w:spacing w:after="80"/>
+      </w:pPr>
+      <w:r>
+        <w:rPr/>
+        <w:t>(iii) Channel movement (Q3.4). Under the communication restriction, gpt-4.1 messages fell by 99.4%, but price-path dependence did not increase. We therefore find no evidence that coordination shifted from messages into prices.</w:t>
       </w:r>
     </w:p>
     <w:p>
@@ -1557,7 +1577,7 @@
       </w:pPr>
       <w:r>
         <w:rPr/>
-        <w:t>• One market environment with homogeneous costs and values; one main model family for the new runs; the failed positive control means we could not test lever benefits on the same model.</w:t>
+        <w:t>• The study uses one market environment with homogeneous costs and values, and one main model family for the new experiments. Because the positive control failed, we could not test intervention benefits on the same model.</w:t>
       </w:r>
     </w:p>
     <w:p>
@@ -1567,7 +1587,7 @@
       </w:pPr>
       <w:r>
         <w:rPr/>
-        <w:t>• Collusion in this harness is model-specific: gpt-4.1 shows weak communication-driven collusion, Llama-3.3-70B and GPT-4.1-mini do not.</w:t>
+        <w:t>• Collusion in this harness depends on the model: gpt-4.1 shows weak communication-driven collusion, whereas Llama-3.3-70B and GPT-4.1-mini do not.</w:t>
       </w:r>
     </w:p>
     <w:p>
@@ -1577,7 +1597,7 @@
       </w:pPr>
       <w:r>
         <w:rPr/>
-        <w:t>• The cost results in Section 4.4 were found after inspecting the data. Of the three we then tested on fresh pre-registered runs, the two welfare effects replicated and the trade-volume effect did not, and the route by which the warning hurts buyers (fewer trades in one sample, higher prices in the other) is not stable.</w:t>
+        <w:t>• The cost findings in Section 4.4 emerged after inspecting the data. Of the three effects tested on fresh, pre-registered runs, the two welfare effects replicated, but the trade-volume effect did not. The mechanism behind the warning's harm to buyers also varied between fewer trades and higher prices.</w:t>
       </w:r>
     </w:p>
     <w:p>
@@ -1587,7 +1607,7 @@
       </w:pPr>
       <w:r>
         <w:rPr/>
-        <w:t>• The monitor's threshold and permanent gag are the harness defaults; other thresholds would change false-positive rates.</w:t>
+        <w:t>• The monitor threshold and permanent communication restriction are the harness defaults. Different thresholds could produce different false-positive rates.</w:t>
       </w:r>
     </w:p>
     <w:p>
@@ -1597,7 +1617,7 @@
       </w:pPr>
       <w:r>
         <w:rPr/>
-        <w:t>• Buyer welfare and trades are in-market costs; costs outside the market (for example, lost legitimate coordination) are not measured.</w:t>
+        <w:t>• We measure costs through buyer welfare and completed trades within the market. Other costs, such as losing opportunities for legitimate coordination, are not captured.</w:t>
       </w:r>
     </w:p>
     <w:p>
@@ -1607,7 +1627,7 @@
       </w:pPr>
       <w:r>
         <w:rPr/>
-        <w:t>• Thirty rounds limit the power of information-theoretic detectors.</w:t>
+        <w:t>• The 30-round environment limits the statistical power of information-theoretic detectors.</w:t>
       </w:r>
     </w:p>
     <w:p>
@@ -1735,7 +1755,7 @@
       </w:pPr>
       <w:r>
         <w:rPr/>
-        <w:t>M.N.J. selected the study and sprint questions, made the go/no-go and budget decisions at each stage, wrote the abstract, introduction, related work, results interpretation paragraphs, discussion, and conclusion, and reviewed the full manuscript. Claude wrote the analysis and experiment code, ran the experiments, conducted the statistical analysis, and drafted the Methods, Results, and appendices.</w:t>
+        <w:t>M.N.J. selected the study and sprint questions, made the go/no-go and budget decisions at each stage, wrote the report text (abstract, introduction, related work, methods, results, discussion, limitations, conclusion, Appendix A, and the negative result in Appendix B), and reviewed the full manuscript. Claude wrote the analysis and experiment code, ran the experiments, conducted the statistical analysis, produced the tables and figures, and wrote the captions, the one-sentence lead-ins to Sections 4.4 and 4.5, and the Code and Data section.</w:t>
       </w:r>
     </w:p>
     <w:p>
@@ -2051,7 +2071,7 @@
       </w:r>
       <w:r>
         <w:rPr/>
-        <w:t xml:space="preserve"> We establish, for one simulated double auction, that the reference oversight lever behaves as a delayed ban, that an LLM monitor misfires on non-colluding markets, and, in a pre-registered replication on fresh runs, that a monitoring warning lowers buyer welfare and a single no-regret seller raises it where no collusion is present. We do not establish that any lever reduces collusion in Llama-3.3-70B markets, because those markets did not collude, nor that these magnitudes transfer to real markets, other models, or other market designs.</w:t>
+        <w:t xml:space="preserve"> Our results establish that, in one simulated double auction, the reference oversight mechanism behaves like a delayed communication ban and an LLM monitor can incorrectly flag markets that are not colluding. A pre-registered replication on fresh runs also confirms that a monitoring warning reduces buyer welfare, while introducing a single no-regret seller improves it when collusion is absent. However, we do not establish that any intervention reduces collusion in Llama-3.3-70B markets, since those markets did not collude. Nor can we assume that the measured effects will carry over to real markets, other models, or different market designs.</w:t>
       </w:r>
     </w:p>
     <w:p>
@@ -2066,7 +2086,7 @@
       </w:r>
       <w:r>
         <w:rPr/>
-        <w:t xml:space="preserve"> Ranking levers by cost also tells a colluding operator which restrictions are cheapest to resist or to lobby against, and showing that a warning can be costly could be used to argue against oversight in general; our results argue for measuring and calibrating oversight, not for removing it. Detector power limits indicate how short or noisy coordination must be to evade a statistical monitor. We report aggregate effects only and provide no method for evading monitors. All agents are simulated; no real market, firm or person is involved.</w:t>
+        <w:t xml:space="preserve"> Measuring the costs of interventions can also reveal which restrictions a colluding operator might find easiest to resist or challenge. Similarly, showing that a warning can harm buyers could be used to argue against oversight more broadly. That is not the conclusion supported by our findings: the aim is to measure and calibrate oversight, not remove it. The limits of detector performance also indicate how short or noisy coordination may be while remaining difficult to detect statistically. To reduce these risks, we report aggregate results without providing methods for evading monitors. All agents are simulated, and no real market, firm, or person is involved.</w:t>
       </w:r>
     </w:p>
     <w:p>
@@ -3501,12 +3521,13 @@
     </w:p>
     <w:p>
       <w:pPr>
+        <w:keepNext/>
         <w:jc w:val="center"/>
       </w:pPr>
       <w:r>
         <w:drawing>
           <wp:inline>
-            <wp:extent cx="5943600" cy="3302000"/>
+            <wp:extent cx="5486400" cy="3048000"/>
             <wp:docPr id="3" name="Picture 3"/>
             <wp:cNvGraphicFramePr>
               <a:graphicFrameLocks noChangeAspect="1"/>
@@ -3527,7 +3548,7 @@
                   <pic:spPr>
                     <a:xfrm>
                       <a:off x="0" y="0"/>
-                      <a:ext cx="5943600" cy="3302000"/>
+                      <a:ext cx="5486400" cy="3048000"/>
                     </a:xfrm>
                     <a:prstGeom prst="rect"/>
                   </pic:spPr>
@@ -3558,12 +3579,13 @@
     </w:p>
     <w:p>
       <w:pPr>
+        <w:keepNext/>
         <w:jc w:val="center"/>
       </w:pPr>
       <w:r>
         <w:drawing>
           <wp:inline>
-            <wp:extent cx="5943600" cy="3531283"/>
+            <wp:extent cx="5486400" cy="3259646"/>
             <wp:docPr id="4" name="Picture 4"/>
             <wp:cNvGraphicFramePr>
               <a:graphicFrameLocks noChangeAspect="1"/>
@@ -3584,7 +3606,7 @@
                   <pic:spPr>
                     <a:xfrm>
                       <a:off x="0" y="0"/>
-                      <a:ext cx="5943600" cy="3531283"/>
+                      <a:ext cx="5486400" cy="3259646"/>
                     </a:xfrm>
                     <a:prstGeom prst="rect"/>
                   </pic:spPr>
@@ -3625,7 +3647,7 @@
       </w:r>
       <w:r>
         <w:rPr/>
-        <w:t xml:space="preserve"> An exploratory signal (the share of rounds in which sellers leave their ask unchanged tracked the judge's coordination score, rho=+0.81 in the gpt-4.1 runs) failed a pre-registered replication on 25 held-out cross-model runs (rho=+0.16, p=0.22): Claude sellers hold low prices just as stickily.</w:t>
+        <w:t xml:space="preserve"> In the gpt-4.1 runs, the share of rounds in which sellers kept their asks unchanged tracked the judge's coordination score (rho=+0.81). However, this signal failed a pre-registered replication across 25 held-out cross-model runs (rho=+0.16, p=0.22). The result suggests that stable asking behaviour alone is not a reliable indicator of coordination, since Claude sellers also maintained low prices consistently without necessarily colluding.</w:t>
       </w:r>
     </w:p>
     <w:p>
@@ -3642,7 +3664,7 @@
       </w:pPr>
       <w:r>
         <w:rPr/>
-        <w:t>Claude (Anthropic) was used to write and test the analysis and experiment tooling, run experiments under the pre-registered protocol, conduct statistical analyses, check citations against their sources, and draft the Methods, Results, and appendices. M.N.J. wrote the abstract, introduction, related work, results interpretation paragraphs, discussion, and conclusion. All numerical results were regenerated from the logged runs and checked by script against the outputs in the public repository.</w:t>
+        <w:t>Claude (Anthropic) was used to write and test the analysis and experiment tooling, run experiments under the pre-registered protocol, conduct statistical analyses, check citations against their sources, produce the tables and figures, and write the captions and the Code and Data section. Claude also wrote an earlier full draft of the report; M.N.J. then rewrote the report text from fact lists Claude prepared, and Claude checked the rewritten text against the data, making small wording corrections. All numerical results were regenerated from the logged runs and checked by script against the outputs in the public repository.</w:t>
       </w:r>
     </w:p>
     <w:sectPr>

</xml_diff>